<commit_message>
Guida comande: corregge punto 4 e rimuove punto 5
Filtri: solo per famiglia prodotti (non per stato).
Aggiunto Riepilogo e cambio ordinamento. Rimosso punto 5.

Co-Authored-By: Claude Sonnet 4.6 <noreply@anthropic.com>
</commit_message>
<xml_diff>
--- a/guide/Guida_Rapida_Comande.docx
+++ b/guide/Guida_Rapida_Comande.docx
@@ -283,207 +283,19 @@
         <w:spacing w:before="160" w:after="60"/>
       </w:pPr>
       <w:r>
-        <w:t>4. Filtri</w:t>
-      </w:r>
-    </w:p>
-    <w:tbl>
-      <w:tblPr>
-        <w:tblW w:w="9360" w:type="dxa"/>
-        <w:tblInd w:w="130" w:type="dxa"/>
-        <w:tblBorders>
-          <w:top w:val="single" w:sz="4" w:space="0" w:color="auto"/>
-          <w:left w:val="single" w:sz="4" w:space="0" w:color="auto"/>
-          <w:bottom w:val="single" w:sz="4" w:space="0" w:color="auto"/>
-          <w:right w:val="single" w:sz="4" w:space="0" w:color="auto"/>
-          <w:insideH w:val="single" w:sz="4" w:space="0" w:color="auto"/>
-          <w:insideV w:val="single" w:sz="4" w:space="0" w:color="auto"/>
-        </w:tblBorders>
-        <w:tblCellMar>
-          <w:left w:w="10" w:type="dxa"/>
-          <w:right w:w="10" w:type="dxa"/>
-        </w:tblCellMar>
-        <w:tblLook w:val="04A0"/>
-      </w:tblPr>
-      <w:tblGrid>
-        <w:gridCol w:w="3500"/>
-        <w:gridCol w:w="5860"/>
-      </w:tblGrid>
-      <w:tr>
-        <w:tblPrEx>
-          <w:tblCellMar>
-            <w:top w:w="0" w:type="dxa"/>
-            <w:bottom w:w="0" w:type="dxa"/>
-          </w:tblCellMar>
-        </w:tblPrEx>
-        <w:tc>
-          <w:tcPr>
-            <w:tcW w:w="3500" w:type="dxa"/>
-            <w:tcBorders>
-              <w:top w:val="single" w:sz="1" w:space="0" w:color="CCCCCC"/>
-              <w:left w:val="single" w:sz="1" w:space="0" w:color="CCCCCC"/>
-              <w:bottom w:val="single" w:sz="1" w:space="0" w:color="CCCCCC"/>
-              <w:right w:val="single" w:sz="1" w:space="0" w:color="CCCCCC"/>
-            </w:tcBorders>
-            <w:shd w:val="clear" w:color="auto" w:fill="F5F5F5"/>
-            <w:tcMar>
-              <w:top w:w="80" w:type="dxa"/>
-              <w:left w:w="140" w:type="dxa"/>
-              <w:bottom w:w="80" w:type="dxa"/>
-              <w:right w:w="140" w:type="dxa"/>
-            </w:tcMar>
-          </w:tcPr>
-          <w:p>
-            <w:r>
-              <w:rPr>
-                <w:b/>
-              </w:rPr>
-              <w:t>Filtro</w:t>
-            </w:r>
-          </w:p>
-        </w:tc>
-        <w:tc>
-          <w:tcPr>
-            <w:tcW w:w="5860" w:type="dxa"/>
-            <w:tcBorders>
-              <w:top w:val="single" w:sz="1" w:space="0" w:color="CCCCCC"/>
-              <w:left w:val="single" w:sz="1" w:space="0" w:color="CCCCCC"/>
-              <w:bottom w:val="single" w:sz="1" w:space="0" w:color="CCCCCC"/>
-              <w:right w:val="single" w:sz="1" w:space="0" w:color="CCCCCC"/>
-            </w:tcBorders>
-            <w:shd w:val="clear" w:color="auto" w:fill="F5F5F5"/>
-            <w:tcMar>
-              <w:top w:w="80" w:type="dxa"/>
-              <w:left w:w="140" w:type="dxa"/>
-              <w:bottom w:w="80" w:type="dxa"/>
-              <w:right w:w="140" w:type="dxa"/>
-            </w:tcMar>
-          </w:tcPr>
-          <w:p>
-            <w:r>
-              <w:rPr>
-                <w:b/>
-              </w:rPr>
-              <w:t>Mostra</w:t>
-            </w:r>
-          </w:p>
-        </w:tc>
-      </w:tr>
-      <w:tr>
-        <w:tc>
-          <w:tcPr>
-            <w:tcW w:type="dxa" w:w="3500"/>
-          </w:tcPr>
-          <w:p>
-            <w:r>
-              <w:t>Tutti</w:t>
-            </w:r>
-          </w:p>
-        </w:tc>
-        <w:tc>
-          <w:tcPr>
-            <w:tcW w:type="dxa" w:w="5860"/>
-          </w:tcPr>
-          <w:p>
-            <w:r>
-              <w:t>Tutte le comande attive (in attesa + pronte)</w:t>
-            </w:r>
-          </w:p>
-        </w:tc>
-      </w:tr>
-      <w:tr>
-        <w:tc>
-          <w:tcPr>
-            <w:tcW w:type="dxa" w:w="3500"/>
-          </w:tcPr>
-          <w:p>
-            <w:r>
-              <w:t>In attesa</w:t>
-            </w:r>
-          </w:p>
-        </w:tc>
-        <w:tc>
-          <w:tcPr>
-            <w:tcW w:type="dxa" w:w="5860"/>
-          </w:tcPr>
-          <w:p>
-            <w:r>
-              <w:t>Solo le comande ancora da preparare</w:t>
-            </w:r>
-          </w:p>
-        </w:tc>
-      </w:tr>
-      <w:tr>
-        <w:tc>
-          <w:tcPr>
-            <w:tcW w:type="dxa" w:w="3500"/>
-          </w:tcPr>
-          <w:p>
-            <w:r>
-              <w:t>Pronte</w:t>
-            </w:r>
-          </w:p>
-        </w:tc>
-        <w:tc>
-          <w:tcPr>
-            <w:tcW w:type="dxa" w:w="5860"/>
-          </w:tcPr>
-          <w:p>
-            <w:r>
-              <w:t>Solo le comande pronte da servire</w:t>
-            </w:r>
-          </w:p>
-        </w:tc>
-      </w:tr>
-      <w:tr>
-        <w:tc>
-          <w:tcPr>
-            <w:tcW w:type="dxa" w:w="3500"/>
-          </w:tcPr>
-          <w:p>
-            <w:r>
-              <w:t>Asporto</w:t>
-            </w:r>
-          </w:p>
-        </w:tc>
-        <w:tc>
-          <w:tcPr>
-            <w:tcW w:type="dxa" w:w="5860"/>
-          </w:tcPr>
-          <w:p>
-            <w:r>
-              <w:t>Solo gli ordini con flag asporto attivo</w:t>
-            </w:r>
-          </w:p>
-        </w:tc>
-      </w:tr>
-    </w:tbl>
-    <w:p>
-      <w:pPr>
+        <w:t>4. Filtri, riepilogo e ordinamento</w:t>
+      </w:r>
+    </w:p>
+    <w:p>
+      <w:pPr>
+        <w:pStyle w:val="Heading20"/>
         <w:pBdr>
-          <w:left w:val="single" w:sz="12" w:space="8" w:color="16A34A"/>
+          <w:bottom w:val="single" w:sz="4" w:space="4" w:color="D97706"/>
         </w:pBdr>
-        <w:shd w:val="clear" w:color="auto" w:fill="F0FDF4"/>
-        <w:spacing w:before="100" w:after="100"/>
-        <w:ind w:left="200"/>
-      </w:pPr>
-      <w:r>
-        <w:rPr>
-          <w:b/>
-          <w:color w:val="16A34A"/>
-        </w:rPr>
-        <w:t xml:space="preserve">Suggerimento: </w:t>
-      </w:r>
-      <w:r>
-        <w:t>Nelle serate affollate usa In attesa per concentrarti su ciò che ancora non hai preparato.</w:t>
-      </w:r>
-    </w:p>
-    <w:p>
-      <w:pPr>
-        <w:pStyle w:val="Heading10"/>
-        <w:spacing w:before="160" w:after="60"/>
-      </w:pPr>
-      <w:r>
-        <w:t>5. Se una comanda non arriva</w:t>
+        <w:spacing w:before="100" w:after="40"/>
+      </w:pPr>
+      <w:r>
+        <w:t>Filtro per famiglia</w:t>
       </w:r>
     </w:p>
     <w:p>
@@ -491,66 +303,47 @@
         <w:spacing w:after="80"/>
       </w:pPr>
       <w:r>
-        <w:t>La comanda appare sulla pagina non appena la cassa conferma lo scontrino. Se non appare:</w:t>
-      </w:r>
-    </w:p>
-    <w:p>
-      <w:pPr>
-        <w:pStyle w:val="Paragrafoelenco"/>
-        <w:numPr>
-          <w:ilvl w:val="0"/>
-          <w:numId w:val="2"/>
-        </w:numPr>
-        <w:spacing w:before="20" w:after="20"/>
-      </w:pPr>
-      <w:r>
-        <w:t>Verifica che lo scontrino sia stato confermato (non solo composto)</w:t>
-      </w:r>
-    </w:p>
-    <w:p>
-      <w:pPr>
-        <w:pStyle w:val="Paragrafoelenco"/>
-        <w:numPr>
-          <w:ilvl w:val="0"/>
-          <w:numId w:val="2"/>
-        </w:numPr>
-        <w:spacing w:before="20" w:after="20"/>
-      </w:pPr>
-      <w:r>
-        <w:t>Ricarica la pagina manualmente</w:t>
-      </w:r>
-    </w:p>
-    <w:p>
-      <w:pPr>
-        <w:pStyle w:val="Paragrafoelenco"/>
-        <w:numPr>
-          <w:ilvl w:val="0"/>
-          <w:numId w:val="2"/>
-        </w:numPr>
-        <w:spacing w:before="20" w:after="20"/>
-      </w:pPr>
-      <w:r>
-        <w:t>Controlla che il server (PocketBase) sia in esecuzione</w:t>
-      </w:r>
-    </w:p>
-    <w:p>
-      <w:pPr>
+        <w:t>In cima alla schermata sono presenti i pulsanti delle famiglie di prodotti (es. Cucina, Bar, Dolci). Selezionando una famiglia si vedono solo le comande che contengono prodotti di quella famiglia.</w:t>
+      </w:r>
+    </w:p>
+    <w:p>
+      <w:pPr>
+        <w:pStyle w:val="Heading20"/>
         <w:pBdr>
-          <w:left w:val="single" w:sz="12" w:space="8" w:color="DC2626"/>
+          <w:bottom w:val="single" w:sz="4" w:space="4" w:color="D97706"/>
         </w:pBdr>
-        <w:shd w:val="clear" w:color="auto" w:fill="FEF2F2"/>
-        <w:spacing w:before="100" w:after="100"/>
-        <w:ind w:left="200"/>
-      </w:pPr>
-      <w:r>
-        <w:rPr>
-          <w:b/>
-          <w:color w:val="DC2626"/>
-        </w:rPr>
-        <w:t xml:space="preserve">Attenzione: </w:t>
-      </w:r>
-      <w:r>
-        <w:t>Non chiudere la finestra del browser durante il servizio — la pagina perderebbe gli aggiornamenti automatici.</w:t>
+        <w:spacing w:before="100" w:after="40"/>
+      </w:pPr>
+      <w:r>
+        <w:t>Riepilogo</w:t>
+      </w:r>
+    </w:p>
+    <w:p>
+      <w:pPr>
+        <w:spacing w:after="80"/>
+      </w:pPr>
+      <w:r>
+        <w:t>Il pulsante Riepilogo mostra un conteggio aggregato di tutti i prodotti ancora da preparare, raggruppati per tipo. Utile per avere un colpo d'occhio su quante porzioni mancano prima di servire.</w:t>
+      </w:r>
+    </w:p>
+    <w:p>
+      <w:pPr>
+        <w:pStyle w:val="Heading20"/>
+        <w:pBdr>
+          <w:bottom w:val="single" w:sz="4" w:space="4" w:color="D97706"/>
+        </w:pBdr>
+        <w:spacing w:before="100" w:after="40"/>
+      </w:pPr>
+      <w:r>
+        <w:t>Ordinamento</w:t>
+      </w:r>
+    </w:p>
+    <w:p>
+      <w:pPr>
+        <w:spacing w:after="80"/>
+      </w:pPr>
+      <w:r>
+        <w:t>È possibile cambiare l'ordinamento delle card tra: per ora di arrivo (default) e per tavolo.</w:t>
       </w:r>
     </w:p>
   </w:body>

</xml_diff>

<commit_message>
Guida comande: corregge flusso evasione e rimuove filtro asporto
Nessuna distinzione pronta/evasa: si spuntano i prodotti singoli
e poi si preme Segna come evasa. Nessun filtro asporto nella barra.

Co-Authored-By: Claude Sonnet 4.6 <noreply@anthropic.com>
</commit_message>
<xml_diff>
--- a/guide/Guida_Rapida_Comande.docx
+++ b/guide/Guida_Rapida_Comande.docx
@@ -122,18 +122,6 @@
     </w:p>
     <w:p>
       <w:pPr>
-        <w:pStyle w:val="Heading20"/>
-        <w:pBdr>
-          <w:bottom w:val="single" w:sz="4" w:space="4" w:color="D97706"/>
-        </w:pBdr>
-        <w:spacing w:before="100" w:after="40"/>
-      </w:pPr>
-      <w:r>
-        <w:t>Segnare come pronta</w:t>
-      </w:r>
-    </w:p>
-    <w:p>
-      <w:pPr>
         <w:pStyle w:val="Paragrafoelenco"/>
         <w:numPr>
           <w:ilvl w:val="0"/>
@@ -155,7 +143,7 @@
         <w:spacing w:before="20" w:after="20"/>
       </w:pPr>
       <w:r>
-        <w:t>Premi il pulsante Pronta sulla card</w:t>
+        <w:t>Man mano che i prodotti sono pronti, selezionali sulla card (spunta singola riga)</w:t>
       </w:r>
     </w:p>
     <w:p>
@@ -168,19 +156,7 @@
         <w:spacing w:before="20" w:after="20"/>
       </w:pPr>
       <w:r>
-        <w:t>La card cambia aspetto: segnala che è pronta da servire</w:t>
-      </w:r>
-    </w:p>
-    <w:p>
-      <w:pPr>
-        <w:pStyle w:val="Heading20"/>
-        <w:pBdr>
-          <w:bottom w:val="single" w:sz="4" w:space="4" w:color="D97706"/>
-        </w:pBdr>
-        <w:spacing w:before="100" w:after="40"/>
-      </w:pPr>
-      <w:r>
-        <w:t>Segnare come servita / consegnata</w:t>
+        <w:t>Quando tutto è pronto, premi il pulsante Segna come evasa</w:t>
       </w:r>
     </w:p>
     <w:p>
@@ -193,19 +169,6 @@
         <w:spacing w:before="20" w:after="20"/>
       </w:pPr>
       <w:r>
-        <w:t>Premi Consegnata sulla card pronta</w:t>
-      </w:r>
-    </w:p>
-    <w:p>
-      <w:pPr>
-        <w:pStyle w:val="Paragrafoelenco"/>
-        <w:numPr>
-          <w:ilvl w:val="0"/>
-          <w:numId w:val="3"/>
-        </w:numPr>
-        <w:spacing w:before="20" w:after="20"/>
-      </w:pPr>
-      <w:r>
         <w:t>La comanda scompare dalla lista attiva e viene archiviata</w:t>
       </w:r>
     </w:p>
@@ -226,7 +189,7 @@
         <w:t xml:space="preserve">Suggerimento: </w:t>
       </w:r>
       <w:r>
-        <w:t>Usa Pronta quando il prodotto è pronto al banco; usa Consegnata solo dopo averlo portato al tavolo o consegnato all'asportante.</w:t>
+        <w:t>Puoi spuntare i prodotti uno alla volta mentre li prepari, senza evasione immediata.</w:t>
       </w:r>
     </w:p>
     <w:p>
@@ -261,20 +224,7 @@
         <w:spacing w:before="20" w:after="20"/>
       </w:pPr>
       <w:r>
-        <w:t>Seguono lo stesso flusso delle comande normali (Pronta → Consegnata)</w:t>
-      </w:r>
-    </w:p>
-    <w:p>
-      <w:pPr>
-        <w:pStyle w:val="Paragrafoelenco"/>
-        <w:numPr>
-          <w:ilvl w:val="0"/>
-          <w:numId w:val="2"/>
-        </w:numPr>
-        <w:spacing w:before="20" w:after="20"/>
-      </w:pPr>
-      <w:r>
-        <w:t>Puoi filtrarli con il tasto Asporto nella barra filtri (vedi sezione 4)</w:t>
+        <w:t>Seguono lo stesso flusso delle comande normali: spunta prodotti → Segna come evasa</w:t>
       </w:r>
     </w:p>
     <w:p>

</xml_diff>